<commit_message>
EricMarcon published a site update
</commit_message>
<xml_diff>
--- a/RevFinal.docx
+++ b/RevFinal.docx
@@ -7,7 +7,7 @@
         <w:pStyle w:val="Date"/>
       </w:pPr>
       <w:r>
-        <w:t xml:space="preserve">October 12, 2026</w:t>
+        <w:t xml:space="preserve">October 13, 2026</w:t>
       </w:r>
     </w:p>
     <w:p>
@@ -4088,7 +4088,7 @@
         <w:t xml:space="preserve"> </w:t>
       </w:r>
       <w:r>
-        <w:t xml:space="preserve">0.99) using the mentioned relation:</w:t>
+        <w:t xml:space="preserve">0.98) using the mentioned relation:</w:t>
       </w:r>
       <w:r>
         <w:t xml:space="preserve"> </w:t>
@@ -4184,7 +4184,7 @@
         </m:r>
       </m:oMath>
       <w:r>
-        <w:t xml:space="preserve"> points (e.g., 9.33 seconds for 100,000 points), knowing the time</w:t>
+        <w:t xml:space="preserve"> points (e.g., 6.69 seconds for 100,000 points), knowing the time</w:t>
       </w:r>
       <w:r>
         <w:t xml:space="preserve"> </w:t>
@@ -4464,7 +4464,7 @@
         <w:t xml:space="preserve">M</w:t>
       </w:r>
       <w:r>
-        <w:t xml:space="preserve"> is &lt; 10 seconds for a set of 100,000 points on a modern computer</w:t>
+        <w:t xml:space="preserve"> is &lt; 7 seconds for a set of 100,000 points on a modern computer</w:t>
       </w:r>
       <w:r>
         <w:rPr>
@@ -4482,19 +4482,19 @@
         <w:t xml:space="preserve"> </w:t>
       </w:r>
       <w:r>
-        <w:t xml:space="preserve">Therefore, calculating a confidence interval from 1,000 simulations requires less than 167 minutes.</w:t>
-      </w:r>
-      <w:r>
-        <w:t xml:space="preserve"> </w:t>
-      </w:r>
-      <w:r>
-        <w:t xml:space="preserve">For a set of five million points, the power law predicts around 112 minutes of computing time.</w:t>
-      </w:r>
-      <w:r>
-        <w:t xml:space="preserve"> </w:t>
-      </w:r>
-      <w:r>
-        <w:t xml:space="preserve">Accordingly, 1,000 simulations would take around 78 days.</w:t>
+        <w:t xml:space="preserve">Therefore, calculating a confidence interval from 1,000 simulations requires less than 117 minutes.</w:t>
+      </w:r>
+      <w:r>
+        <w:t xml:space="preserve"> </w:t>
+      </w:r>
+      <w:r>
+        <w:t xml:space="preserve">For a set of five million points, the power law predicts around 57 minutes of computing time.</w:t>
+      </w:r>
+      <w:r>
+        <w:t xml:space="preserve"> </w:t>
+      </w:r>
+      <w:r>
+        <w:t xml:space="preserve">Accordingly, 1,000 simulations would take around 39 days.</w:t>
       </w:r>
     </w:p>
     <w:p>

</xml_diff>